<commit_message>
ca9: same positions in all engines outside the cover; leaders at least three spaces long (fb-595.54)
Signature block at half the text width; footnote marks at 58 %; latex footnotes at the
foot of the page with typst's clearance and gaps, line boxes and ragged right kept inside
the insert; one page-number position; TOA/TOC leaders never vanish. fb diff --engines
reports width, left-edge and baseline drift of identical lines (diagnostic). TOA checker
ignores a title's trailing period.
</commit_message>
<xml_diff>
--- a/courts/ninth-circuit/court-of-appeals/usage/OUTPUT-opening-brief-2.docx
+++ b/courts/ninth-circuit/court-of-appeals/usage/OUTPUT-opening-brief-2.docx
@@ -581,7 +581,7 @@
       <w:pPr>
         <w:keepLines/>
         <w:spacing w:before="0" w:after="0" w:line="340" w:lineRule="exact"/>
-        <w:ind w:left="4680"/>
+        <w:ind w:left="4680" w:firstLine="140"/>
       </w:pPr>
       <w:r>
         <w:rPr>
@@ -637,7 +637,7 @@
       <w:pPr>
         <w:keepLines/>
         <w:spacing w:before="0" w:after="0" w:line="340" w:lineRule="exact"/>
-        <w:ind w:left="4680"/>
+        <w:ind w:left="4680" w:firstLine="140"/>
       </w:pPr>
       <w:r>
         <w:rPr>
@@ -707,7 +707,7 @@
       <w:pPr>
         <w:keepLines/>
         <w:spacing w:before="0" w:after="0" w:line="340" w:lineRule="exact"/>
-        <w:ind w:left="4680"/>
+        <w:ind w:left="4680" w:firstLine="140"/>
       </w:pPr>
       <w:r>
         <w:rPr>
@@ -771,7 +771,7 @@
       <w:pPr>
         <w:keepLines/>
         <w:spacing w:before="0" w:after="0" w:line="340" w:lineRule="exact"/>
-        <w:ind w:left="4680"/>
+        <w:ind w:left="4680" w:firstLine="140"/>
       </w:pPr>
       <w:r>
         <w:rPr>
@@ -813,7 +813,7 @@
       <w:pPr>
         <w:keepLines/>
         <w:spacing w:before="0" w:after="0" w:line="340" w:lineRule="exact"/>
-        <w:ind w:left="4680"/>
+        <w:ind w:left="4680" w:firstLine="140"/>
       </w:pPr>
       <w:r>
         <w:rPr>
@@ -855,7 +855,7 @@
       <w:pPr>
         <w:keepLines/>
         <w:spacing w:before="0" w:after="0" w:line="340" w:lineRule="exact"/>
-        <w:ind w:left="4680"/>
+        <w:ind w:left="4680" w:firstLine="140"/>
       </w:pPr>
       <w:r>
         <w:rPr>
@@ -897,7 +897,7 @@
       <w:pPr>
         <w:keepLines/>
         <w:spacing w:before="0" w:after="0" w:line="340" w:lineRule="exact"/>
-        <w:ind w:left="4680"/>
+        <w:ind w:left="4680" w:firstLine="140"/>
       </w:pPr>
       <w:r>
         <w:rPr>
@@ -938,7 +938,7 @@
         <w:sectPr>
           <w:footerReference w:type="default" r:id="rIdFtrNone"/>
           <w:pgSz w:w="12240" w:h="15840"/>
-          <w:pgMar w:top="1440" w:right="1440" w:bottom="1440" w:left="1440" w:header="720" w:footer="576" w:gutter="0"/>
+          <w:pgMar w:top="1440" w:right="1440" w:bottom="1440" w:left="1440" w:header="720" w:footer="676" w:gutter="0"/>
         </w:sectPr>
       </w:pPr>
     </w:p>
@@ -965,7 +965,6 @@
         <w:keepNext/>
         <w:keepLines/>
         <w:spacing w:before="84" w:after="0" w:line="340" w:lineRule="exact"/>
-        <w:ind w:left="0" w:right="20"/>
         <w:jc w:val="right"/>
       </w:pPr>
       <w:r>
@@ -981,13 +980,13 @@
       <w:pPr>
         <w:keepLines/>
         <w:tabs>
-          <w:tab w:val="right" w:leader="dot" w:pos="9340"/>
+          <w:tab w:val="right" w:leader="dot" w:pos="9360"/>
         </w:tabs>
         <w:spacing w:before="168" w:after="0" w:line="340" w:lineRule="exact"/>
         <w:ind w:left="0" w:right="720"/>
       </w:pPr>
       <w:r>
-        <w:t xml:space="preserve">TABLE OF AUTHORITIES</w:t>
+        <w:t xml:space="preserve">TABLE OF AUTHORITIES   </w:t>
       </w:r>
       <w:r>
         <w:tab/>
@@ -1000,13 +999,13 @@
       <w:pPr>
         <w:keepLines/>
         <w:tabs>
-          <w:tab w:val="right" w:leader="dot" w:pos="9340"/>
+          <w:tab w:val="right" w:leader="dot" w:pos="9360"/>
         </w:tabs>
         <w:spacing w:before="168" w:after="0" w:line="340" w:lineRule="exact"/>
         <w:ind w:left="0" w:right="720"/>
       </w:pPr>
       <w:r>
-        <w:t xml:space="preserve">INTRODUCTION</w:t>
+        <w:t xml:space="preserve">INTRODUCTION   </w:t>
       </w:r>
       <w:r>
         <w:tab/>
@@ -1019,13 +1018,13 @@
       <w:pPr>
         <w:keepLines/>
         <w:tabs>
-          <w:tab w:val="right" w:leader="dot" w:pos="9340"/>
+          <w:tab w:val="right" w:leader="dot" w:pos="9360"/>
         </w:tabs>
         <w:spacing w:before="168" w:after="0" w:line="340" w:lineRule="exact"/>
         <w:ind w:left="0" w:right="720"/>
       </w:pPr>
       <w:r>
-        <w:t xml:space="preserve">STATEMENT OF JURISDICTION</w:t>
+        <w:t xml:space="preserve">STATEMENT OF JURISDICTION   </w:t>
       </w:r>
       <w:r>
         <w:tab/>
@@ -1038,13 +1037,13 @@
       <w:pPr>
         <w:keepLines/>
         <w:tabs>
-          <w:tab w:val="right" w:leader="dot" w:pos="9340"/>
+          <w:tab w:val="right" w:leader="dot" w:pos="9360"/>
         </w:tabs>
         <w:spacing w:before="168" w:after="0" w:line="340" w:lineRule="exact"/>
         <w:ind w:left="0" w:right="720"/>
       </w:pPr>
       <w:r>
-        <w:t xml:space="preserve">STATEMENT OF THE ISSUES</w:t>
+        <w:t xml:space="preserve">STATEMENT OF THE ISSUES   </w:t>
       </w:r>
       <w:r>
         <w:tab/>
@@ -1057,13 +1056,13 @@
       <w:pPr>
         <w:keepLines/>
         <w:tabs>
-          <w:tab w:val="right" w:leader="dot" w:pos="9340"/>
+          <w:tab w:val="right" w:leader="dot" w:pos="9360"/>
         </w:tabs>
         <w:spacing w:before="168" w:after="0" w:line="340" w:lineRule="exact"/>
         <w:ind w:left="0" w:right="720"/>
       </w:pPr>
       <w:r>
-        <w:t xml:space="preserve">STATEMENT OF THE CASE</w:t>
+        <w:t xml:space="preserve">STATEMENT OF THE CASE   </w:t>
       </w:r>
       <w:r>
         <w:tab/>
@@ -1076,7 +1075,7 @@
       <w:pPr>
         <w:keepLines/>
         <w:tabs>
-          <w:tab w:val="right" w:leader="dot" w:pos="9340"/>
+          <w:tab w:val="right" w:leader="dot" w:pos="9360"/>
         </w:tabs>
         <w:spacing w:before="98" w:after="0" w:line="340" w:lineRule="exact"/>
         <w:ind w:left="1440" w:right="720" w:hanging="720"/>
@@ -1088,7 +1087,7 @@
         <w:tab/>
       </w:r>
       <w:r>
-        <w:t xml:space="preserve">Factual Background</w:t>
+        <w:t xml:space="preserve">Factual Background   </w:t>
       </w:r>
       <w:r>
         <w:tab/>
@@ -1101,7 +1100,7 @@
       <w:pPr>
         <w:keepLines/>
         <w:tabs>
-          <w:tab w:val="right" w:leader="dot" w:pos="9340"/>
+          <w:tab w:val="right" w:leader="dot" w:pos="9360"/>
         </w:tabs>
         <w:spacing w:before="98" w:after="0" w:line="340" w:lineRule="exact"/>
         <w:ind w:left="1440" w:right="720" w:hanging="720"/>
@@ -1113,7 +1112,7 @@
         <w:tab/>
       </w:r>
       <w:r>
-        <w:t xml:space="preserve">Procedural History</w:t>
+        <w:t xml:space="preserve">Procedural History   </w:t>
       </w:r>
       <w:r>
         <w:tab/>
@@ -1126,13 +1125,13 @@
       <w:pPr>
         <w:keepLines/>
         <w:tabs>
-          <w:tab w:val="right" w:leader="dot" w:pos="9340"/>
+          <w:tab w:val="right" w:leader="dot" w:pos="9360"/>
         </w:tabs>
         <w:spacing w:before="168" w:after="0" w:line="340" w:lineRule="exact"/>
         <w:ind w:left="0" w:right="720"/>
       </w:pPr>
       <w:r>
-        <w:t xml:space="preserve">SUMMARY OF ARGUMENT</w:t>
+        <w:t xml:space="preserve">SUMMARY OF ARGUMENT   </w:t>
       </w:r>
       <w:r>
         <w:tab/>
@@ -1145,13 +1144,13 @@
       <w:pPr>
         <w:keepLines/>
         <w:tabs>
-          <w:tab w:val="right" w:leader="dot" w:pos="9340"/>
+          <w:tab w:val="right" w:leader="dot" w:pos="9360"/>
         </w:tabs>
         <w:spacing w:before="168" w:after="0" w:line="340" w:lineRule="exact"/>
         <w:ind w:left="0" w:right="720"/>
       </w:pPr>
       <w:r>
-        <w:t xml:space="preserve">ARGUMENT</w:t>
+        <w:t xml:space="preserve">ARGUMENT   </w:t>
       </w:r>
       <w:r>
         <w:tab/>
@@ -1164,7 +1163,7 @@
       <w:pPr>
         <w:keepLines/>
         <w:tabs>
-          <w:tab w:val="right" w:leader="dot" w:pos="9340"/>
+          <w:tab w:val="right" w:leader="dot" w:pos="9360"/>
         </w:tabs>
         <w:spacing w:before="98" w:after="0" w:line="340" w:lineRule="exact"/>
         <w:ind w:left="720" w:right="720" w:hanging="720"/>
@@ -1176,7 +1175,7 @@
         <w:tab/>
       </w:r>
       <w:r>
-        <w:t xml:space="preserve">The District Court Misread the Act’s Priority Rule</w:t>
+        <w:t xml:space="preserve">The District Court Misread the Act’s Priority Rule   </w:t>
       </w:r>
       <w:r>
         <w:tab/>
@@ -1189,7 +1188,7 @@
       <w:pPr>
         <w:keepLines/>
         <w:tabs>
-          <w:tab w:val="right" w:leader="dot" w:pos="9340"/>
+          <w:tab w:val="right" w:leader="dot" w:pos="9360"/>
         </w:tabs>
         <w:spacing w:before="98" w:after="0" w:line="340" w:lineRule="exact"/>
         <w:ind w:left="1440" w:right="720" w:hanging="720"/>
@@ -1201,7 +1200,7 @@
         <w:tab/>
       </w:r>
       <w:r>
-        <w:t xml:space="preserve">Standard of Review</w:t>
+        <w:t xml:space="preserve">Standard of Review   </w:t>
       </w:r>
       <w:r>
         <w:tab/>
@@ -1214,7 +1213,7 @@
       <w:pPr>
         <w:keepLines/>
         <w:tabs>
-          <w:tab w:val="right" w:leader="dot" w:pos="9340"/>
+          <w:tab w:val="right" w:leader="dot" w:pos="9360"/>
         </w:tabs>
         <w:spacing w:before="98" w:after="0" w:line="340" w:lineRule="exact"/>
         <w:ind w:left="1440" w:right="720" w:hanging="720"/>
@@ -1226,7 +1225,7 @@
         <w:tab/>
       </w:r>
       <w:r>
-        <w:t xml:space="preserve">The Text Fixes Priority and Leaves No Discretion</w:t>
+        <w:t xml:space="preserve">The Text Fixes Priority and Leaves No Discretion   </w:t>
       </w:r>
       <w:r>
         <w:tab/>
@@ -1239,7 +1238,7 @@
       <w:pPr>
         <w:keepLines/>
         <w:tabs>
-          <w:tab w:val="right" w:leader="dot" w:pos="9340"/>
+          <w:tab w:val="right" w:leader="dot" w:pos="9360"/>
         </w:tabs>
         <w:spacing w:before="98" w:after="0" w:line="340" w:lineRule="exact"/>
         <w:ind w:left="2160" w:right="720" w:hanging="720"/>
@@ -1251,7 +1250,7 @@
         <w:tab/>
       </w:r>
       <w:r>
-        <w:t xml:space="preserve">The District’s Contrary Reading Cannot Be Squared with the Statute’s Structure</w:t>
+        <w:t xml:space="preserve">The District’s Contrary Reading Cannot Be Squared with the Statute’s Structure   </w:t>
       </w:r>
       <w:r>
         <w:tab/>
@@ -1264,7 +1263,7 @@
       <w:pPr>
         <w:keepLines/>
         <w:tabs>
-          <w:tab w:val="right" w:leader="dot" w:pos="9340"/>
+          <w:tab w:val="right" w:leader="dot" w:pos="9360"/>
         </w:tabs>
         <w:spacing w:before="98" w:after="0" w:line="340" w:lineRule="exact"/>
         <w:ind w:left="720" w:right="720" w:hanging="720"/>
@@ -1276,7 +1275,7 @@
         <w:tab/>
       </w:r>
       <w:r>
-        <w:t xml:space="preserve">The District Court Resolved Disputed Facts Against Appellants</w:t>
+        <w:t xml:space="preserve">The District Court Resolved Disputed Facts Against Appellants   </w:t>
       </w:r>
       <w:r>
         <w:tab/>
@@ -1289,7 +1288,7 @@
       <w:pPr>
         <w:keepLines/>
         <w:tabs>
-          <w:tab w:val="right" w:leader="dot" w:pos="9340"/>
+          <w:tab w:val="right" w:leader="dot" w:pos="9360"/>
         </w:tabs>
         <w:spacing w:before="98" w:after="0" w:line="340" w:lineRule="exact"/>
         <w:ind w:left="1440" w:right="720" w:hanging="720"/>
@@ -1301,7 +1300,7 @@
         <w:tab/>
       </w:r>
       <w:r>
-        <w:t xml:space="preserve">Judicial Notice Does Not Fill the Gap</w:t>
+        <w:t xml:space="preserve">Judicial Notice Does Not Fill the Gap   </w:t>
       </w:r>
       <w:r>
         <w:tab/>
@@ -1314,7 +1313,7 @@
       <w:pPr>
         <w:keepLines/>
         <w:tabs>
-          <w:tab w:val="right" w:leader="dot" w:pos="9340"/>
+          <w:tab w:val="right" w:leader="dot" w:pos="9360"/>
         </w:tabs>
         <w:spacing w:before="98" w:after="0" w:line="340" w:lineRule="exact"/>
         <w:ind w:left="2160" w:right="720" w:hanging="720"/>
@@ -1326,7 +1325,7 @@
         <w:tab/>
       </w:r>
       <w:r>
-        <w:t xml:space="preserve">The Treatises Agree</w:t>
+        <w:t xml:space="preserve">The Treatises Agree   </w:t>
       </w:r>
       <w:r>
         <w:tab/>
@@ -1339,7 +1338,7 @@
       <w:pPr>
         <w:keepLines/>
         <w:tabs>
-          <w:tab w:val="right" w:leader="dot" w:pos="9340"/>
+          <w:tab w:val="right" w:leader="dot" w:pos="9360"/>
         </w:tabs>
         <w:spacing w:before="98" w:after="0" w:line="340" w:lineRule="exact"/>
         <w:ind w:left="720" w:right="720" w:hanging="720"/>
@@ -1351,7 +1350,7 @@
         <w:tab/>
       </w:r>
       <w:r>
-        <w:t xml:space="preserve">The Court Should Reach the Statutory Question Now</w:t>
+        <w:t xml:space="preserve">The Court Should Reach the Statutory Question Now   </w:t>
       </w:r>
       <w:r>
         <w:tab/>
@@ -1364,13 +1363,13 @@
       <w:pPr>
         <w:keepLines/>
         <w:tabs>
-          <w:tab w:val="right" w:leader="dot" w:pos="9340"/>
+          <w:tab w:val="right" w:leader="dot" w:pos="9360"/>
         </w:tabs>
         <w:spacing w:before="168" w:after="0" w:line="340" w:lineRule="exact"/>
         <w:ind w:left="0" w:right="720"/>
       </w:pPr>
       <w:r>
-        <w:t xml:space="preserve">CONCLUSION</w:t>
+        <w:t xml:space="preserve">CONCLUSION   </w:t>
       </w:r>
       <w:r>
         <w:tab/>
@@ -1383,13 +1382,13 @@
       <w:pPr>
         <w:keepLines/>
         <w:tabs>
-          <w:tab w:val="right" w:leader="dot" w:pos="9340"/>
+          <w:tab w:val="right" w:leader="dot" w:pos="9360"/>
         </w:tabs>
         <w:spacing w:before="168" w:after="0" w:line="340" w:lineRule="exact"/>
         <w:ind w:left="0" w:right="720"/>
       </w:pPr>
       <w:r>
-        <w:t xml:space="preserve">STATEMENT OF RELATED CASES</w:t>
+        <w:t xml:space="preserve">STATEMENT OF RELATED CASES   </w:t>
       </w:r>
       <w:r>
         <w:tab/>
@@ -1402,13 +1401,13 @@
       <w:pPr>
         <w:keepLines/>
         <w:tabs>
-          <w:tab w:val="right" w:leader="dot" w:pos="9340"/>
+          <w:tab w:val="right" w:leader="dot" w:pos="9360"/>
         </w:tabs>
         <w:spacing w:before="168" w:after="0" w:line="340" w:lineRule="exact"/>
         <w:ind w:left="0" w:right="720"/>
       </w:pPr>
       <w:r>
-        <w:t xml:space="preserve">CERTIFICATE OF COMPLIANCE</w:t>
+        <w:t xml:space="preserve">CERTIFICATE OF COMPLIANCE   </w:t>
       </w:r>
       <w:r>
         <w:tab/>
@@ -1421,13 +1420,13 @@
       <w:pPr>
         <w:keepLines/>
         <w:tabs>
-          <w:tab w:val="right" w:leader="dot" w:pos="9340"/>
+          <w:tab w:val="right" w:leader="dot" w:pos="9360"/>
         </w:tabs>
         <w:spacing w:before="168" w:after="0" w:line="340" w:lineRule="exact"/>
         <w:ind w:left="0" w:right="720"/>
       </w:pPr>
       <w:r>
-        <w:t xml:space="preserve">CERTIFICATE OF SERVICE</w:t>
+        <w:t xml:space="preserve">CERTIFICATE OF SERVICE   </w:t>
       </w:r>
       <w:r>
         <w:tab/>
@@ -1440,13 +1439,13 @@
       <w:pPr>
         <w:keepLines/>
         <w:tabs>
-          <w:tab w:val="right" w:leader="dot" w:pos="9340"/>
+          <w:tab w:val="right" w:leader="dot" w:pos="9360"/>
         </w:tabs>
         <w:spacing w:before="168" w:after="0" w:line="340" w:lineRule="exact"/>
         <w:ind w:left="0" w:right="720"/>
       </w:pPr>
       <w:r>
-        <w:t xml:space="preserve">ADDENDUM</w:t>
+        <w:t xml:space="preserve">ADDENDUM   </w:t>
       </w:r>
       <w:r>
         <w:tab/>
@@ -1482,7 +1481,7 @@
         <w:keepNext/>
         <w:keepLines/>
         <w:tabs>
-          <w:tab w:val="right" w:pos="9340"/>
+          <w:tab w:val="right" w:pos="9360"/>
         </w:tabs>
         <w:spacing w:before="280" w:after="56" w:line="340" w:lineRule="exact"/>
       </w:pPr>
@@ -1509,7 +1508,7 @@
       <w:pPr>
         <w:keepLines/>
         <w:tabs>
-          <w:tab w:val="right" w:leader="dot" w:pos="9340"/>
+          <w:tab w:val="right" w:leader="dot" w:pos="9360"/>
         </w:tabs>
         <w:spacing w:before="196" w:after="0" w:line="340" w:lineRule="exact"/>
         <w:ind w:left="504" w:right="1120" w:hanging="504"/>
@@ -1619,6 +1618,9 @@
         <w:t xml:space="preserve">(2019)</w:t>
       </w:r>
       <w:r>
+        <w:t xml:space="preserve">   </w:t>
+      </w:r>
+      <w:r>
         <w:tab/>
       </w:r>
       <w:r>
@@ -1629,7 +1631,7 @@
       <w:pPr>
         <w:keepLines/>
         <w:tabs>
-          <w:tab w:val="right" w:leader="dot" w:pos="9340"/>
+          <w:tab w:val="right" w:leader="dot" w:pos="9360"/>
         </w:tabs>
         <w:spacing w:before="196" w:after="0" w:line="340" w:lineRule="exact"/>
         <w:ind w:left="504" w:right="1120" w:hanging="504"/>
@@ -1791,6 +1793,9 @@
         <w:t xml:space="preserve">2022)</w:t>
       </w:r>
       <w:r>
+        <w:t xml:space="preserve">   </w:t>
+      </w:r>
+      <w:r>
         <w:tab/>
       </w:r>
       <w:r>
@@ -1801,7 +1806,7 @@
       <w:pPr>
         <w:keepLines/>
         <w:tabs>
-          <w:tab w:val="right" w:leader="dot" w:pos="9340"/>
+          <w:tab w:val="right" w:leader="dot" w:pos="9360"/>
         </w:tabs>
         <w:spacing w:before="196" w:after="0" w:line="340" w:lineRule="exact"/>
         <w:ind w:left="504" w:right="1120" w:hanging="504"/>
@@ -1923,6 +1928,9 @@
         <w:t xml:space="preserve">(2018)</w:t>
       </w:r>
       <w:r>
+        <w:t xml:space="preserve">   </w:t>
+      </w:r>
+      <w:r>
         <w:tab/>
       </w:r>
       <w:r>
@@ -1933,7 +1941,7 @@
       <w:pPr>
         <w:keepLines/>
         <w:tabs>
-          <w:tab w:val="right" w:leader="dot" w:pos="9340"/>
+          <w:tab w:val="right" w:leader="dot" w:pos="9360"/>
         </w:tabs>
         <w:spacing w:before="196" w:after="0" w:line="340" w:lineRule="exact"/>
         <w:ind w:left="504" w:right="1120" w:hanging="504"/>
@@ -2067,6 +2075,9 @@
         <w:t xml:space="preserve">banc)</w:t>
       </w:r>
       <w:r>
+        <w:t xml:space="preserve">   </w:t>
+      </w:r>
+      <w:r>
         <w:tab/>
       </w:r>
       <w:r>
@@ -2077,7 +2088,7 @@
       <w:pPr>
         <w:keepLines/>
         <w:tabs>
-          <w:tab w:val="right" w:leader="dot" w:pos="9340"/>
+          <w:tab w:val="right" w:leader="dot" w:pos="9360"/>
         </w:tabs>
         <w:spacing w:before="196" w:after="0" w:line="340" w:lineRule="exact"/>
         <w:ind w:left="504" w:right="1260" w:hanging="504"/>
@@ -2199,6 +2210,9 @@
         <w:t xml:space="preserve">2021)</w:t>
       </w:r>
       <w:r>
+        <w:t xml:space="preserve">   </w:t>
+      </w:r>
+      <w:r>
         <w:tab/>
       </w:r>
       <w:r>
@@ -2209,7 +2223,7 @@
       <w:pPr>
         <w:keepLines/>
         <w:tabs>
-          <w:tab w:val="right" w:leader="dot" w:pos="9340"/>
+          <w:tab w:val="right" w:leader="dot" w:pos="9360"/>
         </w:tabs>
         <w:spacing w:before="196" w:after="0" w:line="340" w:lineRule="exact"/>
         <w:ind w:left="504" w:right="1120" w:hanging="504"/>
@@ -2331,6 +2345,9 @@
         <w:t xml:space="preserve">2018)</w:t>
       </w:r>
       <w:r>
+        <w:t xml:space="preserve">   </w:t>
+      </w:r>
+      <w:r>
         <w:tab/>
       </w:r>
       <w:r>
@@ -2341,7 +2358,7 @@
       <w:pPr>
         <w:keepLines/>
         <w:tabs>
-          <w:tab w:val="right" w:leader="dot" w:pos="9340"/>
+          <w:tab w:val="right" w:leader="dot" w:pos="9360"/>
         </w:tabs>
         <w:spacing w:before="196" w:after="0" w:line="340" w:lineRule="exact"/>
         <w:ind w:left="504" w:right="1120" w:hanging="504"/>
@@ -2505,6 +2522,9 @@
         <w:t xml:space="preserve">2020)</w:t>
       </w:r>
       <w:r>
+        <w:t xml:space="preserve">   </w:t>
+      </w:r>
+      <w:r>
         <w:tab/>
       </w:r>
       <w:r>
@@ -2515,7 +2535,7 @@
       <w:pPr>
         <w:keepLines/>
         <w:tabs>
-          <w:tab w:val="right" w:leader="dot" w:pos="9340"/>
+          <w:tab w:val="right" w:leader="dot" w:pos="9360"/>
         </w:tabs>
         <w:spacing w:before="196" w:after="0" w:line="340" w:lineRule="exact"/>
         <w:ind w:left="504" w:right="1120" w:hanging="504"/>
@@ -2623,6 +2643,9 @@
         <w:t xml:space="preserve">2016)</w:t>
       </w:r>
       <w:r>
+        <w:t xml:space="preserve">   </w:t>
+      </w:r>
+      <w:r>
         <w:tab/>
       </w:r>
       <w:r>
@@ -2633,7 +2656,7 @@
       <w:pPr>
         <w:keepLines/>
         <w:tabs>
-          <w:tab w:val="right" w:leader="dot" w:pos="9340"/>
+          <w:tab w:val="right" w:leader="dot" w:pos="9360"/>
         </w:tabs>
         <w:spacing w:before="196" w:after="0" w:line="340" w:lineRule="exact"/>
         <w:ind w:left="504" w:right="1120" w:hanging="504"/>
@@ -2753,6 +2776,9 @@
         <w:t xml:space="preserve">2020)</w:t>
       </w:r>
       <w:r>
+        <w:t xml:space="preserve">   </w:t>
+      </w:r>
+      <w:r>
         <w:tab/>
       </w:r>
       <w:r>
@@ -2763,7 +2789,7 @@
       <w:pPr>
         <w:keepLines/>
         <w:tabs>
-          <w:tab w:val="right" w:leader="dot" w:pos="9340"/>
+          <w:tab w:val="right" w:leader="dot" w:pos="9360"/>
         </w:tabs>
         <w:spacing w:before="196" w:after="0" w:line="340" w:lineRule="exact"/>
         <w:ind w:left="504" w:right="1120" w:hanging="504"/>
@@ -2893,6 +2919,9 @@
         <w:t xml:space="preserve">2021)</w:t>
       </w:r>
       <w:r>
+        <w:t xml:space="preserve">   </w:t>
+      </w:r>
+      <w:r>
         <w:tab/>
       </w:r>
       <w:r>
@@ -2903,7 +2932,7 @@
       <w:pPr>
         <w:keepLines/>
         <w:tabs>
-          <w:tab w:val="right" w:leader="dot" w:pos="9340"/>
+          <w:tab w:val="right" w:leader="dot" w:pos="9360"/>
         </w:tabs>
         <w:spacing w:before="196" w:after="0" w:line="340" w:lineRule="exact"/>
         <w:ind w:left="504" w:right="1120" w:hanging="504"/>
@@ -3025,6 +3054,9 @@
         <w:t xml:space="preserve">2015)</w:t>
       </w:r>
       <w:r>
+        <w:t xml:space="preserve">   </w:t>
+      </w:r>
+      <w:r>
         <w:tab/>
       </w:r>
       <w:r>
@@ -3036,7 +3068,7 @@
         <w:keepNext/>
         <w:keepLines/>
         <w:tabs>
-          <w:tab w:val="right" w:pos="9340"/>
+          <w:tab w:val="right" w:pos="9360"/>
         </w:tabs>
         <w:spacing w:before="392" w:after="56" w:line="340" w:lineRule="exact"/>
       </w:pPr>
@@ -3052,7 +3084,7 @@
       <w:pPr>
         <w:keepLines/>
         <w:tabs>
-          <w:tab w:val="right" w:leader="dot" w:pos="9340"/>
+          <w:tab w:val="right" w:leader="dot" w:pos="9360"/>
         </w:tabs>
         <w:spacing w:before="196" w:after="0" w:line="340" w:lineRule="exact"/>
         <w:ind w:left="504" w:right="1120" w:hanging="504"/>
@@ -3091,6 +3123,9 @@
         <w:t xml:space="preserve">2</w:t>
       </w:r>
       <w:r>
+        <w:t xml:space="preserve">   </w:t>
+      </w:r>
+      <w:r>
         <w:tab/>
       </w:r>
       <w:r>
@@ -3101,7 +3136,7 @@
       <w:pPr>
         <w:keepLines/>
         <w:tabs>
-          <w:tab w:val="right" w:leader="dot" w:pos="9340"/>
+          <w:tab w:val="right" w:leader="dot" w:pos="9360"/>
         </w:tabs>
         <w:spacing w:before="196" w:after="0" w:line="340" w:lineRule="exact"/>
         <w:ind w:left="504" w:right="1120" w:hanging="504"/>
@@ -3128,6 +3163,9 @@
         <w:t xml:space="preserve">V</w:t>
       </w:r>
       <w:r>
+        <w:t xml:space="preserve">   </w:t>
+      </w:r>
+      <w:r>
         <w:tab/>
       </w:r>
       <w:r>
@@ -3139,7 +3177,7 @@
         <w:keepNext/>
         <w:keepLines/>
         <w:tabs>
-          <w:tab w:val="right" w:pos="9340"/>
+          <w:tab w:val="right" w:pos="9360"/>
         </w:tabs>
         <w:spacing w:before="392" w:after="56" w:line="340" w:lineRule="exact"/>
       </w:pPr>
@@ -3155,7 +3193,7 @@
       <w:pPr>
         <w:keepLines/>
         <w:tabs>
-          <w:tab w:val="right" w:leader="dot" w:pos="9340"/>
+          <w:tab w:val="right" w:leader="dot" w:pos="9360"/>
         </w:tabs>
         <w:spacing w:before="196" w:after="0" w:line="340" w:lineRule="exact"/>
         <w:ind w:left="504" w:right="1120" w:hanging="504"/>
@@ -3182,6 +3220,9 @@
         <w:t xml:space="preserve">1291</w:t>
       </w:r>
       <w:r>
+        <w:t xml:space="preserve">   </w:t>
+      </w:r>
+      <w:r>
         <w:tab/>
       </w:r>
       <w:r>
@@ -3192,7 +3233,7 @@
       <w:pPr>
         <w:keepLines/>
         <w:tabs>
-          <w:tab w:val="right" w:leader="dot" w:pos="9340"/>
+          <w:tab w:val="right" w:leader="dot" w:pos="9360"/>
         </w:tabs>
         <w:spacing w:before="196" w:after="0" w:line="340" w:lineRule="exact"/>
         <w:ind w:left="504" w:right="1120" w:hanging="504"/>
@@ -3219,6 +3260,9 @@
         <w:t xml:space="preserve">1331</w:t>
       </w:r>
       <w:r>
+        <w:t xml:space="preserve">   </w:t>
+      </w:r>
+      <w:r>
         <w:tab/>
       </w:r>
       <w:r>
@@ -3229,7 +3273,7 @@
       <w:pPr>
         <w:keepLines/>
         <w:tabs>
-          <w:tab w:val="right" w:leader="dot" w:pos="9340"/>
+          <w:tab w:val="right" w:leader="dot" w:pos="9360"/>
         </w:tabs>
         <w:spacing w:before="196" w:after="0" w:line="340" w:lineRule="exact"/>
         <w:ind w:left="504" w:right="1120" w:hanging="504"/>
@@ -3256,6 +3300,9 @@
         <w:t xml:space="preserve">2201</w:t>
       </w:r>
       <w:r>
+        <w:t xml:space="preserve">   </w:t>
+      </w:r>
+      <w:r>
         <w:tab/>
       </w:r>
       <w:r>
@@ -3266,7 +3313,7 @@
       <w:pPr>
         <w:keepLines/>
         <w:tabs>
-          <w:tab w:val="right" w:leader="dot" w:pos="9340"/>
+          <w:tab w:val="right" w:leader="dot" w:pos="9360"/>
         </w:tabs>
         <w:spacing w:before="196" w:after="0" w:line="340" w:lineRule="exact"/>
         <w:ind w:left="504" w:right="1120" w:hanging="504"/>
@@ -3299,6 +3346,9 @@
         <w:t xml:space="preserve">1052</w:t>
       </w:r>
       <w:r>
+        <w:t xml:space="preserve">   </w:t>
+      </w:r>
+      <w:r>
         <w:tab/>
       </w:r>
       <w:r>
@@ -3309,7 +3359,7 @@
       <w:pPr>
         <w:keepLines/>
         <w:tabs>
-          <w:tab w:val="right" w:leader="dot" w:pos="9340"/>
+          <w:tab w:val="right" w:leader="dot" w:pos="9360"/>
         </w:tabs>
         <w:spacing w:before="196" w:after="0" w:line="340" w:lineRule="exact"/>
         <w:ind w:left="504" w:right="1400" w:hanging="504"/>
@@ -3369,6 +3419,9 @@
         <w:t xml:space="preserve">1234</w:t>
       </w:r>
       <w:r>
+        <w:t xml:space="preserve">   </w:t>
+      </w:r>
+      <w:r>
         <w:tab/>
       </w:r>
       <w:r>
@@ -3379,7 +3432,7 @@
       <w:pPr>
         <w:keepLines/>
         <w:tabs>
-          <w:tab w:val="right" w:leader="dot" w:pos="9340"/>
+          <w:tab w:val="right" w:leader="dot" w:pos="9360"/>
         </w:tabs>
         <w:spacing w:before="196" w:after="0" w:line="340" w:lineRule="exact"/>
         <w:ind w:left="504" w:right="1120" w:hanging="504"/>
@@ -3439,6 +3492,9 @@
         <w:t xml:space="preserve">1236(b)</w:t>
       </w:r>
       <w:r>
+        <w:t xml:space="preserve">   </w:t>
+      </w:r>
+      <w:r>
         <w:tab/>
       </w:r>
       <w:r>
@@ -3450,7 +3506,7 @@
         <w:keepNext/>
         <w:keepLines/>
         <w:tabs>
-          <w:tab w:val="right" w:pos="9340"/>
+          <w:tab w:val="right" w:pos="9360"/>
         </w:tabs>
         <w:spacing w:before="392" w:after="56" w:line="340" w:lineRule="exact"/>
       </w:pPr>
@@ -3466,7 +3522,7 @@
       <w:pPr>
         <w:keepLines/>
         <w:tabs>
-          <w:tab w:val="right" w:leader="dot" w:pos="9340"/>
+          <w:tab w:val="right" w:leader="dot" w:pos="9360"/>
         </w:tabs>
         <w:spacing w:before="196" w:after="0" w:line="340" w:lineRule="exact"/>
         <w:ind w:left="504" w:right="1120" w:hanging="504"/>
@@ -3499,6 +3555,9 @@
         <w:t xml:space="preserve">(2023)</w:t>
       </w:r>
       <w:r>
+        <w:t xml:space="preserve">   </w:t>
+      </w:r>
+      <w:r>
         <w:tab/>
       </w:r>
       <w:r>
@@ -3509,7 +3568,7 @@
       <w:pPr>
         <w:keepLines/>
         <w:tabs>
-          <w:tab w:val="right" w:leader="dot" w:pos="9340"/>
+          <w:tab w:val="right" w:leader="dot" w:pos="9360"/>
         </w:tabs>
         <w:spacing w:before="196" w:after="0" w:line="340" w:lineRule="exact"/>
         <w:ind w:left="504" w:right="1120" w:hanging="504"/>
@@ -3542,6 +3601,9 @@
         <w:t xml:space="preserve">(2023)</w:t>
       </w:r>
       <w:r>
+        <w:t xml:space="preserve">   </w:t>
+      </w:r>
+      <w:r>
         <w:tab/>
       </w:r>
       <w:r>
@@ -3553,7 +3615,7 @@
         <w:keepNext/>
         <w:keepLines/>
         <w:tabs>
-          <w:tab w:val="right" w:pos="9340"/>
+          <w:tab w:val="right" w:pos="9360"/>
         </w:tabs>
         <w:spacing w:before="392" w:after="56" w:line="340" w:lineRule="exact"/>
       </w:pPr>
@@ -3569,7 +3631,7 @@
       <w:pPr>
         <w:keepLines/>
         <w:tabs>
-          <w:tab w:val="right" w:leader="dot" w:pos="9340"/>
+          <w:tab w:val="right" w:leader="dot" w:pos="9360"/>
         </w:tabs>
         <w:spacing w:before="196" w:after="0" w:line="340" w:lineRule="exact"/>
         <w:ind w:left="504" w:right="1120" w:hanging="504"/>
@@ -3602,6 +3664,9 @@
         <w:t xml:space="preserve">4(a)(1)(A)</w:t>
       </w:r>
       <w:r>
+        <w:t xml:space="preserve">   </w:t>
+      </w:r>
+      <w:r>
         <w:tab/>
       </w:r>
       <w:r>
@@ -3612,7 +3677,7 @@
       <w:pPr>
         <w:keepLines/>
         <w:tabs>
-          <w:tab w:val="right" w:leader="dot" w:pos="9340"/>
+          <w:tab w:val="right" w:leader="dot" w:pos="9360"/>
         </w:tabs>
         <w:spacing w:before="196" w:after="0" w:line="340" w:lineRule="exact"/>
         <w:ind w:left="504" w:right="1120" w:hanging="504"/>
@@ -3645,6 +3710,9 @@
         <w:t xml:space="preserve">12(b)(6)</w:t>
       </w:r>
       <w:r>
+        <w:t xml:space="preserve">   </w:t>
+      </w:r>
+      <w:r>
         <w:tab/>
       </w:r>
       <w:r>
@@ -3655,7 +3723,7 @@
       <w:pPr>
         <w:keepLines/>
         <w:tabs>
-          <w:tab w:val="right" w:leader="dot" w:pos="9340"/>
+          <w:tab w:val="right" w:leader="dot" w:pos="9360"/>
         </w:tabs>
         <w:spacing w:before="196" w:after="0" w:line="340" w:lineRule="exact"/>
         <w:ind w:left="504" w:right="1120" w:hanging="504"/>
@@ -3688,6 +3756,9 @@
         <w:t xml:space="preserve">56(a)</w:t>
       </w:r>
       <w:r>
+        <w:t xml:space="preserve">   </w:t>
+      </w:r>
+      <w:r>
         <w:tab/>
       </w:r>
       <w:r>
@@ -3698,7 +3769,7 @@
       <w:pPr>
         <w:keepLines/>
         <w:tabs>
-          <w:tab w:val="right" w:leader="dot" w:pos="9340"/>
+          <w:tab w:val="right" w:leader="dot" w:pos="9360"/>
         </w:tabs>
         <w:spacing w:before="196" w:after="0" w:line="340" w:lineRule="exact"/>
         <w:ind w:left="504" w:right="1120" w:hanging="504"/>
@@ -3725,6 +3796,9 @@
         <w:t xml:space="preserve">201</w:t>
       </w:r>
       <w:r>
+        <w:t xml:space="preserve">   </w:t>
+      </w:r>
+      <w:r>
         <w:tab/>
       </w:r>
       <w:r>
@@ -3736,7 +3810,7 @@
         <w:keepNext/>
         <w:keepLines/>
         <w:tabs>
-          <w:tab w:val="right" w:pos="9340"/>
+          <w:tab w:val="right" w:pos="9360"/>
         </w:tabs>
         <w:spacing w:before="392" w:after="56" w:line="340" w:lineRule="exact"/>
       </w:pPr>
@@ -3752,7 +3826,7 @@
       <w:pPr>
         <w:keepLines/>
         <w:tabs>
-          <w:tab w:val="right" w:leader="dot" w:pos="9340"/>
+          <w:tab w:val="right" w:leader="dot" w:pos="9360"/>
         </w:tabs>
         <w:spacing w:before="196" w:after="0" w:line="340" w:lineRule="exact"/>
         <w:ind w:left="504" w:right="1120" w:hanging="504"/>
@@ -3797,6 +3871,9 @@
         <w:t xml:space="preserve">2023)</w:t>
       </w:r>
       <w:r>
+        <w:t xml:space="preserve">   </w:t>
+      </w:r>
+      <w:r>
         <w:tab/>
       </w:r>
       <w:r>
@@ -3807,7 +3884,7 @@
       <w:pPr>
         <w:keepLines/>
         <w:tabs>
-          <w:tab w:val="right" w:leader="dot" w:pos="9340"/>
+          <w:tab w:val="right" w:leader="dot" w:pos="9360"/>
         </w:tabs>
         <w:spacing w:before="196" w:after="0" w:line="340" w:lineRule="exact"/>
         <w:ind w:left="504" w:right="1120" w:hanging="504"/>
@@ -3899,6 +3976,9 @@
         <w:t xml:space="preserve">(2022)</w:t>
       </w:r>
       <w:r>
+        <w:t xml:space="preserve">   </w:t>
+      </w:r>
+      <w:r>
         <w:tab/>
       </w:r>
       <w:r>
@@ -3909,7 +3989,7 @@
       <w:pPr>
         <w:keepLines/>
         <w:tabs>
-          <w:tab w:val="right" w:leader="dot" w:pos="9340"/>
+          <w:tab w:val="right" w:leader="dot" w:pos="9360"/>
         </w:tabs>
         <w:spacing w:before="196" w:after="0" w:line="340" w:lineRule="exact"/>
         <w:ind w:left="504" w:right="1120" w:hanging="504"/>
@@ -4018,6 +4098,9 @@
       </w:r>
       <w:r>
         <w:t xml:space="preserve">2020)</w:t>
+      </w:r>
+      <w:r>
+        <w:t xml:space="preserve">   </w:t>
       </w:r>
       <w:r>
         <w:tab/>
@@ -4032,7 +4115,7 @@
         <w:sectPr>
           <w:footerReference w:type="default" r:id="rIdFtrPage"/>
           <w:pgSz w:w="12240" w:h="15840"/>
-          <w:pgMar w:top="1440" w:right="1440" w:bottom="1440" w:left="1440" w:header="720" w:footer="576" w:gutter="0"/>
+          <w:pgMar w:top="1440" w:right="1440" w:bottom="1440" w:left="1440" w:header="720" w:footer="676" w:gutter="0"/>
           <w:pgNumType w:fmt="lowerRoman" w:start="1"/>
         </w:sectPr>
       </w:pPr>
@@ -4042,7 +4125,7 @@
         <w:pStyle w:val="Heading1"/>
         <w:keepNext/>
         <w:keepLines/>
-        <w:spacing w:before="420" w:after="308" w:line="400" w:lineRule="exact"/>
+        <w:spacing w:before="0" w:after="308" w:line="400" w:lineRule="exact"/>
         <w:ind w:left="0" w:firstLine="0"/>
         <w:jc w:val="center"/>
       </w:pPr>
@@ -7832,7 +7915,7 @@
         <w:sectPr>
           <w:footerReference w:type="default" r:id="rIdFtrPage"/>
           <w:pgSz w:w="12240" w:h="15840"/>
-          <w:pgMar w:top="1440" w:right="1440" w:bottom="1440" w:left="1440" w:header="720" w:footer="576" w:gutter="0"/>
+          <w:pgMar w:top="1440" w:right="1440" w:bottom="1440" w:left="1440" w:header="720" w:footer="676" w:gutter="0"/>
           <w:pgNumType w:fmt="decimal" w:start="1"/>
         </w:sectPr>
       </w:pPr>
@@ -7878,13 +7961,13 @@
       <w:pPr>
         <w:keepLines/>
         <w:tabs>
-          <w:tab w:val="right" w:leader="dot" w:pos="9340"/>
+          <w:tab w:val="right" w:leader="dot" w:pos="9360"/>
         </w:tabs>
         <w:spacing w:before="98" w:after="0" w:line="340" w:lineRule="exact"/>
         <w:ind w:left="0" w:right="720"/>
       </w:pPr>
       <w:r>
-        <w:t xml:space="preserve">Riverbend Municipal Water Rights Act, 99 U.S.C. § 1234 (fictional)</w:t>
+        <w:t xml:space="preserve">Riverbend Municipal Water Rights Act, 99 U.S.C. § 1234 (fictional)   </w:t>
       </w:r>
       <w:r>
         <w:tab/>
@@ -7899,13 +7982,13 @@
       <w:pPr>
         <w:keepLines/>
         <w:tabs>
-          <w:tab w:val="right" w:leader="dot" w:pos="9340"/>
+          <w:tab w:val="right" w:leader="dot" w:pos="9360"/>
         </w:tabs>
         <w:spacing w:before="98" w:after="0" w:line="340" w:lineRule="exact"/>
         <w:ind w:left="0" w:right="720"/>
       </w:pPr>
       <w:r>
-        <w:t xml:space="preserve">Riverbend Municipal Water Rights Act, 99 U.S.C. § 1236(b) (fictional)</w:t>
+        <w:t xml:space="preserve">Riverbend Municipal Water Rights Act, 99 U.S.C. § 1236(b) (fictional)   </w:t>
       </w:r>
       <w:r>
         <w:tab/>
@@ -7920,13 +8003,13 @@
       <w:pPr>
         <w:keepLines/>
         <w:tabs>
-          <w:tab w:val="right" w:leader="dot" w:pos="9340"/>
+          <w:tab w:val="right" w:leader="dot" w:pos="9360"/>
         </w:tabs>
         <w:spacing w:before="98" w:after="0" w:line="340" w:lineRule="exact"/>
         <w:ind w:left="0" w:right="720"/>
       </w:pPr>
       <w:r>
-        <w:t xml:space="preserve">99 C.F.R. § 400.21(c) (2023) (fictional)</w:t>
+        <w:t xml:space="preserve">99 C.F.R. § 400.21(c) (2023) (fictional)   </w:t>
       </w:r>
       <w:r>
         <w:tab/>
@@ -7943,7 +8026,7 @@
         <w:keepNext/>
         <w:keepLines/>
         <w:pageBreakBefore/>
-        <w:spacing w:before="440" w:after="360" w:line="340" w:lineRule="exact"/>
+        <w:spacing w:before="0" w:after="252" w:line="340" w:lineRule="exact"/>
         <w:ind w:left="0" w:firstLine="0"/>
       </w:pPr>
       <w:r>
@@ -8103,7 +8186,7 @@
         <w:pStyle w:val="Heading2"/>
         <w:keepNext/>
         <w:keepLines/>
-        <w:spacing w:before="440" w:after="360" w:line="340" w:lineRule="exact"/>
+        <w:spacing w:before="336" w:after="252" w:line="340" w:lineRule="exact"/>
         <w:ind w:left="0" w:firstLine="0"/>
       </w:pPr>
       <w:r>
@@ -8263,7 +8346,7 @@
         <w:pStyle w:val="Heading2"/>
         <w:keepNext/>
         <w:keepLines/>
-        <w:spacing w:before="440" w:after="360" w:line="340" w:lineRule="exact"/>
+        <w:spacing w:before="336" w:after="252" w:line="340" w:lineRule="exact"/>
         <w:ind w:left="0" w:firstLine="0"/>
       </w:pPr>
       <w:r>
@@ -8365,7 +8448,7 @@
     <w:sectPr>
       <w:footerReference w:type="default" r:id="rIdFtrAdd"/>
       <w:pgSz w:w="12240" w:h="15840"/>
-      <w:pgMar w:top="1440" w:right="1440" w:bottom="1440" w:left="1440" w:header="720" w:footer="576" w:gutter="0"/>
+      <w:pgMar w:top="1440" w:right="1440" w:bottom="1440" w:left="1440" w:header="720" w:footer="676" w:gutter="0"/>
       <w:pgNumType w:fmt="decimal" w:start="1"/>
     </w:sectPr>
   </w:body>

</xml_diff>

<commit_message>
ca9 selftest: latex-kerning mutant (XENG-003); mutants follow the new template; sample 2 re-padded so a citation opens a page; review and stamps current (fb-595.54)
</commit_message>
<xml_diff>
--- a/courts/ninth-circuit/court-of-appeals/usage/OUTPUT-opening-brief-2.docx
+++ b/courts/ninth-circuit/court-of-appeals/usage/OUTPUT-opening-brief-2.docx
@@ -4107,7 +4107,7 @@
         <w:tab/>
       </w:r>
       <w:r>
-        <w:t xml:space="preserve">8</w:t>
+        <w:t xml:space="preserve">9</w:t>
       </w:r>
     </w:p>
     <w:p>
@@ -6061,7 +6061,7 @@
         <w:pStyle w:val="BodyText"/>
       </w:pPr>
       <w:r>
-        <w:t xml:space="preserve">Commentators likewise treat priority as a rule enforceable against the manager. Eleanor Whitfield,</w:t>
+        <w:t xml:space="preserve">Commentators likewise treat priority as a rule enforceable against the manager and against each official who administers curtailment for the District. Eleanor Whitfield,</w:t>
       </w:r>
       <w:r>
         <w:t xml:space="preserve"> </w:t>
@@ -7366,7 +7366,7 @@
         <w:ind w:left="0"/>
       </w:pPr>
       <w:r>
-        <w:t xml:space="preserve">This brief contains 1,912 words, including 0 words manually counted in any visual images, and excluding the items exempted by FRAP 32(f). The brief’s type size and typeface comply with FRAP 32(a)(5) and (6).</w:t>
+        <w:t xml:space="preserve">This brief contains 1,922 words, including 0 words manually counted in any visual images, and excluding the items exempted by FRAP 32(f). The brief’s type size and typeface comply with FRAP 32(a)(5) and (6).</w:t>
       </w:r>
     </w:p>
     <w:p>

</xml_diff>